<commit_message>
docs(rapport): enrich rentabilisation chapter with exhaustive plan breakdown and growth plan
</commit_message>
<xml_diff>
--- a/docs/livraison-encadrant-2026/01_Rapport_PFA_LexHub.docx
+++ b/docs/livraison-encadrant-2026/01_Rapport_PFA_LexHub.docx
@@ -3860,7 +3860,7 @@
       <w:tr>
         <w:tc>
           <w:tcPr>
-            <w:tcW w:type="dxa" w:w="1701"/>
+            <w:tcW w:type="dxa" w:w="1587"/>
             <w:shd w:fill="0B1A4D" w:val="clear"/>
           </w:tcPr>
           <w:p>
@@ -3882,7 +3882,7 @@
         </w:tc>
         <w:tc>
           <w:tcPr>
-            <w:tcW w:type="dxa" w:w="1417"/>
+            <w:tcW w:type="dxa" w:w="1361"/>
             <w:shd w:fill="0B1A4D" w:val="clear"/>
           </w:tcPr>
           <w:p>
@@ -3904,7 +3904,7 @@
         </w:tc>
         <w:tc>
           <w:tcPr>
-            <w:tcW w:type="dxa" w:w="1417"/>
+            <w:tcW w:type="dxa" w:w="1361"/>
             <w:shd w:fill="0B1A4D" w:val="clear"/>
           </w:tcPr>
           <w:p>
@@ -3926,7 +3926,7 @@
         </w:tc>
         <w:tc>
           <w:tcPr>
-            <w:tcW w:type="dxa" w:w="1417"/>
+            <w:tcW w:type="dxa" w:w="1361"/>
             <w:shd w:fill="0B1A4D" w:val="clear"/>
           </w:tcPr>
           <w:p>
@@ -3994,7 +3994,7 @@
       <w:tr>
         <w:tc>
           <w:tcPr>
-            <w:tcW w:type="dxa" w:w="1701"/>
+            <w:tcW w:type="dxa" w:w="1587"/>
           </w:tcPr>
           <w:p>
             <w:pPr>
@@ -4015,7 +4015,7 @@
         </w:tc>
         <w:tc>
           <w:tcPr>
-            <w:tcW w:type="dxa" w:w="1417"/>
+            <w:tcW w:type="dxa" w:w="1361"/>
           </w:tcPr>
           <w:p>
             <w:pPr>
@@ -4036,7 +4036,7 @@
         </w:tc>
         <w:tc>
           <w:tcPr>
-            <w:tcW w:type="dxa" w:w="1417"/>
+            <w:tcW w:type="dxa" w:w="1361"/>
           </w:tcPr>
           <w:p>
             <w:pPr>
@@ -4057,7 +4057,7 @@
         </w:tc>
         <w:tc>
           <w:tcPr>
-            <w:tcW w:type="dxa" w:w="1417"/>
+            <w:tcW w:type="dxa" w:w="1361"/>
           </w:tcPr>
           <w:p>
             <w:pPr>
@@ -4122,7 +4122,7 @@
       <w:tr>
         <w:tc>
           <w:tcPr>
-            <w:tcW w:type="dxa" w:w="1701"/>
+            <w:tcW w:type="dxa" w:w="1587"/>
             <w:shd w:fill="F8FAFC" w:val="clear"/>
           </w:tcPr>
           <w:p>
@@ -4144,7 +4144,7 @@
         </w:tc>
         <w:tc>
           <w:tcPr>
-            <w:tcW w:type="dxa" w:w="1417"/>
+            <w:tcW w:type="dxa" w:w="1361"/>
             <w:shd w:fill="F8FAFC" w:val="clear"/>
           </w:tcPr>
           <w:p>
@@ -4166,7 +4166,7 @@
         </w:tc>
         <w:tc>
           <w:tcPr>
-            <w:tcW w:type="dxa" w:w="1417"/>
+            <w:tcW w:type="dxa" w:w="1361"/>
             <w:shd w:fill="F8FAFC" w:val="clear"/>
           </w:tcPr>
           <w:p>
@@ -4188,7 +4188,7 @@
         </w:tc>
         <w:tc>
           <w:tcPr>
-            <w:tcW w:type="dxa" w:w="1417"/>
+            <w:tcW w:type="dxa" w:w="1361"/>
             <w:shd w:fill="F8FAFC" w:val="clear"/>
           </w:tcPr>
           <w:p>
@@ -4256,7 +4256,7 @@
       <w:tr>
         <w:tc>
           <w:tcPr>
-            <w:tcW w:type="dxa" w:w="1701"/>
+            <w:tcW w:type="dxa" w:w="1587"/>
           </w:tcPr>
           <w:p>
             <w:pPr>
@@ -4277,7 +4277,7 @@
         </w:tc>
         <w:tc>
           <w:tcPr>
-            <w:tcW w:type="dxa" w:w="1417"/>
+            <w:tcW w:type="dxa" w:w="1361"/>
           </w:tcPr>
           <w:p>
             <w:pPr>
@@ -4298,7 +4298,7 @@
         </w:tc>
         <w:tc>
           <w:tcPr>
-            <w:tcW w:type="dxa" w:w="1417"/>
+            <w:tcW w:type="dxa" w:w="1361"/>
           </w:tcPr>
           <w:p>
             <w:pPr>
@@ -4319,7 +4319,7 @@
         </w:tc>
         <w:tc>
           <w:tcPr>
-            <w:tcW w:type="dxa" w:w="1417"/>
+            <w:tcW w:type="dxa" w:w="1361"/>
           </w:tcPr>
           <w:p>
             <w:pPr>
@@ -4384,7 +4384,7 @@
       <w:tr>
         <w:tc>
           <w:tcPr>
-            <w:tcW w:type="dxa" w:w="1701"/>
+            <w:tcW w:type="dxa" w:w="1587"/>
             <w:shd w:fill="F8FAFC" w:val="clear"/>
           </w:tcPr>
           <w:p>
@@ -4406,7 +4406,7 @@
         </w:tc>
         <w:tc>
           <w:tcPr>
-            <w:tcW w:type="dxa" w:w="1417"/>
+            <w:tcW w:type="dxa" w:w="1361"/>
             <w:shd w:fill="F8FAFC" w:val="clear"/>
           </w:tcPr>
           <w:p>
@@ -4428,7 +4428,7 @@
         </w:tc>
         <w:tc>
           <w:tcPr>
-            <w:tcW w:type="dxa" w:w="1417"/>
+            <w:tcW w:type="dxa" w:w="1361"/>
             <w:shd w:fill="F8FAFC" w:val="clear"/>
           </w:tcPr>
           <w:p>
@@ -4450,7 +4450,7 @@
         </w:tc>
         <w:tc>
           <w:tcPr>
-            <w:tcW w:type="dxa" w:w="1417"/>
+            <w:tcW w:type="dxa" w:w="1361"/>
             <w:shd w:fill="F8FAFC" w:val="clear"/>
           </w:tcPr>
           <w:p>
@@ -4515,6 +4515,134 @@
           </w:p>
         </w:tc>
       </w:tr>
+      <w:tr>
+        <w:tc>
+          <w:tcPr>
+            <w:tcW w:type="dxa" w:w="1587"/>
+          </w:tcPr>
+          <w:p>
+            <w:pPr>
+              <w:spacing w:after="60" w:before="60"/>
+            </w:pPr>
+            <w:r/>
+            <w:r>
+              <w:rPr>
+                <w:rFonts w:ascii="Calibri" w:hAnsi="Calibri" w:eastAsia="Calibri"/>
+                <w:b w:val="0"/>
+                <w:i w:val="0"/>
+                <w:color w:val="1F2937"/>
+                <w:sz w:val="18"/>
+              </w:rPr>
+              <w:t>Sur mesure</w:t>
+            </w:r>
+          </w:p>
+        </w:tc>
+        <w:tc>
+          <w:tcPr>
+            <w:tcW w:type="dxa" w:w="1361"/>
+          </w:tcPr>
+          <w:p>
+            <w:pPr>
+              <w:spacing w:after="60" w:before="60"/>
+            </w:pPr>
+            <w:r/>
+            <w:r>
+              <w:rPr>
+                <w:rFonts w:ascii="Calibri" w:hAnsi="Calibri" w:eastAsia="Calibri"/>
+                <w:b w:val="0"/>
+                <w:i w:val="0"/>
+                <w:color w:val="1F2937"/>
+                <w:sz w:val="18"/>
+              </w:rPr>
+              <w:t>Sur devis</w:t>
+            </w:r>
+          </w:p>
+        </w:tc>
+        <w:tc>
+          <w:tcPr>
+            <w:tcW w:type="dxa" w:w="1361"/>
+          </w:tcPr>
+          <w:p>
+            <w:pPr>
+              <w:spacing w:after="60" w:before="60"/>
+            </w:pPr>
+            <w:r/>
+            <w:r>
+              <w:rPr>
+                <w:rFonts w:ascii="Calibri" w:hAnsi="Calibri" w:eastAsia="Calibri"/>
+                <w:b w:val="0"/>
+                <w:i w:val="0"/>
+                <w:color w:val="1F2937"/>
+                <w:sz w:val="18"/>
+              </w:rPr>
+              <w:t>Devis annuel</w:t>
+            </w:r>
+          </w:p>
+        </w:tc>
+        <w:tc>
+          <w:tcPr>
+            <w:tcW w:type="dxa" w:w="1361"/>
+          </w:tcPr>
+          <w:p>
+            <w:pPr>
+              <w:spacing w:after="60" w:before="60"/>
+            </w:pPr>
+            <w:r/>
+            <w:r>
+              <w:rPr>
+                <w:rFonts w:ascii="Calibri" w:hAnsi="Calibri" w:eastAsia="Calibri"/>
+                <w:b w:val="0"/>
+                <w:i w:val="0"/>
+                <w:color w:val="1F2937"/>
+                <w:sz w:val="18"/>
+              </w:rPr>
+              <w:t>Sur cadrage</w:t>
+            </w:r>
+          </w:p>
+        </w:tc>
+        <w:tc>
+          <w:tcPr>
+            <w:tcW w:type="dxa" w:w="1984"/>
+          </w:tcPr>
+          <w:p>
+            <w:pPr>
+              <w:spacing w:after="60" w:before="60"/>
+            </w:pPr>
+            <w:r/>
+            <w:r>
+              <w:rPr>
+                <w:rFonts w:ascii="Calibri" w:hAnsi="Calibri" w:eastAsia="Calibri"/>
+                <w:b w:val="0"/>
+                <w:i w:val="0"/>
+                <w:color w:val="1F2937"/>
+                <w:sz w:val="18"/>
+              </w:rPr>
+              <w:t>Illimité / Sur mesure</w:t>
+            </w:r>
+          </w:p>
+        </w:tc>
+        <w:tc>
+          <w:tcPr>
+            <w:tcW w:type="dxa" w:w="1984"/>
+          </w:tcPr>
+          <w:p>
+            <w:pPr>
+              <w:spacing w:after="60" w:before="60"/>
+            </w:pPr>
+            <w:r/>
+            <w:r>
+              <w:rPr>
+                <w:rFonts w:ascii="Calibri" w:hAnsi="Calibri" w:eastAsia="Calibri"/>
+                <w:b w:val="0"/>
+                <w:i w:val="0"/>
+                <w:color w:val="1F2937"/>
+                <w:sz w:val="18"/>
+              </w:rPr>
+              <w:t>Structures &gt; 15 avocats, réseaux</w:t>
+            </w:r>
+          </w:p>
+        </w:tc>
+      </w:tr>
     </w:tbl>
     <w:p>
       <w:pPr>
@@ -4535,7 +4663,119 @@
           <w:color w:val="0B1A4D"/>
           <w:sz w:val="26"/>
         </w:rPr>
-        <w:t>5.3 Qualification commerciale Entreprise et Deux Piliers anti-fraude</w:t>
+        <w:t>5.3 Analyse détaillée de chaque plan de la grille</w:t>
+      </w:r>
+    </w:p>
+    <w:p>
+      <w:pPr>
+        <w:spacing w:before="0" w:after="120" w:line="276" w:lineRule="auto"/>
+      </w:pPr>
+      <w:r>
+        <w:rPr>
+          <w:rFonts w:ascii="Calibri" w:hAnsi="Calibri" w:eastAsia="Calibri"/>
+          <w:b w:val="0"/>
+          <w:i w:val="0"/>
+          <w:color w:val="4A5568"/>
+          <w:sz w:val="22"/>
+        </w:rPr>
+        <w:t>Chaque formule tarifaire a été modélisée pour répondre précisément aux besoins organisationnels et économiques des différentes catégories de praticiens marocains :</w:t>
+      </w:r>
+    </w:p>
+    <w:p>
+      <w:pPr>
+        <w:pStyle w:val="ListBullet"/>
+        <w:spacing w:after="60" w:line="276" w:lineRule="auto"/>
+      </w:pPr>
+      <w:r>
+        <w:rPr>
+          <w:rFonts w:ascii="Calibri" w:hAnsi="Calibri" w:eastAsia="Calibri"/>
+          <w:b w:val="0"/>
+          <w:i w:val="0"/>
+          <w:color w:val="4A5568"/>
+          <w:sz w:val="21"/>
+        </w:rPr>
+        <w:t>Plan Découverte (0 MAD — Freemium d'acquisition) : Conçu pour lever tous les freins à l'adoption, ce forfait offre 1 compte utilisateur, 3 dossiers, 3 plaidoiries complètes et 50 crédits d'accueil. Il permet à l'avocat d'éprouver immédiatement la qualité de la reconnaissance vocale et de la mise en page Word sans engagement et sans carte bancaire (repère journalier de 12 crédits/jour).</w:t>
+      </w:r>
+    </w:p>
+    <w:p>
+      <w:pPr>
+        <w:pStyle w:val="ListBullet"/>
+        <w:spacing w:after="60" w:line="276" w:lineRule="auto"/>
+      </w:pPr>
+      <w:r>
+        <w:rPr>
+          <w:rFonts w:ascii="Calibri" w:hAnsi="Calibri" w:eastAsia="Calibri"/>
+          <w:b w:val="0"/>
+          <w:i w:val="0"/>
+          <w:color w:val="4A5568"/>
+          <w:sz w:val="21"/>
+        </w:rPr>
+        <w:t>Plan Solo (299 MAD HT/mois ou 2 990 MAD/an) : Dédié à l'avocat exerçant en individuel, il inclut 1 siège avocat + 1 siège assistant juridique offert (2 utilisateurs), 35 plaidoiries et 600 crédits par mois. L'essai hybride de 14 jours (400 crédits) permet de valider le produit sur des dossiers réels avec un repère de confort de 35 crédits/jour en essai, passant à 50 crédits/jour en formule payante.</w:t>
+      </w:r>
+    </w:p>
+    <w:p>
+      <w:pPr>
+        <w:pStyle w:val="ListBullet"/>
+        <w:spacing w:after="60" w:line="276" w:lineRule="auto"/>
+      </w:pPr>
+      <w:r>
+        <w:rPr>
+          <w:rFonts w:ascii="Calibri" w:hAnsi="Calibri" w:eastAsia="Calibri"/>
+          <w:b w:val="0"/>
+          <w:i w:val="0"/>
+          <w:color w:val="4A5568"/>
+          <w:sz w:val="21"/>
+        </w:rPr>
+        <w:t>Plan Cabinet (699 MAD HT/mois ou 6 990 MAD/an — Formule recommandée) : Cœur de cible du marché, il comprend 5 sièges avocats + 3 sièges assistants (8 collaborateurs inclus), 120 plaidoiries et 2 000 crédits mensuels. L'essai de 30 jours est plafonné à 1 000 crédits (repère journalier de 90 cr./j en essai, 180 cr./j en payé). Il offre la possibilité exclusive d'ajouter jusqu'à 5 sièges avocats à 99 MAD/mois par collaborateur.</w:t>
+      </w:r>
+    </w:p>
+    <w:p>
+      <w:pPr>
+        <w:pStyle w:val="ListBullet"/>
+        <w:spacing w:after="60" w:line="276" w:lineRule="auto"/>
+      </w:pPr>
+      <w:r>
+        <w:rPr>
+          <w:rFonts w:ascii="Calibri" w:hAnsi="Calibri" w:eastAsia="Calibri"/>
+          <w:b w:val="0"/>
+          <w:i w:val="0"/>
+          <w:color w:val="4A5568"/>
+          <w:sz w:val="21"/>
+        </w:rPr>
+        <w:t>Plan Entreprise (1 290 MAD HT/mois ou 12 900 MAD/an) : Adapté aux cabinets d'affaires de premier plan, il inclut 15 sièges avocats + 10 sièges assistants (25 collaborateurs inclus), 350 plaidoiries et 5 000 crédits mensuels (repère de 105 cr./j en essai et 300 cr./j en payé). Son accès fait l'objet d'un processus commercial qualifié strict.</w:t>
+      </w:r>
+    </w:p>
+    <w:p>
+      <w:pPr>
+        <w:pStyle w:val="ListBullet"/>
+        <w:spacing w:after="60" w:line="276" w:lineRule="auto"/>
+      </w:pPr>
+      <w:r>
+        <w:rPr>
+          <w:rFonts w:ascii="Calibri" w:hAnsi="Calibri" w:eastAsia="Calibri"/>
+          <w:b w:val="0"/>
+          <w:i w:val="0"/>
+          <w:color w:val="4A5568"/>
+          <w:sz w:val="21"/>
+        </w:rPr>
+        <w:t>Palier Sur mesure (Sur devis) : Pour les structures dépassant 15 avocats, proposant un hébergement souverain isolé (Single-Tenant), des connecteurs ERP personnalisés et un support d'astreinte 24/7.</w:t>
+      </w:r>
+    </w:p>
+    <w:p>
+      <w:pPr>
+        <w:pStyle w:val="Heading2"/>
+        <w:keepNext/>
+        <w:spacing w:before="240" w:after="100"/>
+      </w:pPr>
+      <w:r>
+        <w:rPr>
+          <w:rFonts w:ascii="Calibri" w:hAnsi="Calibri" w:eastAsia="Calibri"/>
+          <w:b/>
+          <w:i w:val="0"/>
+          <w:color w:val="0B1A4D"/>
+          <w:sz w:val="26"/>
+        </w:rPr>
+        <w:t>5.4 Qualification commerciale Entreprise et Deux Piliers anti-fraude</w:t>
       </w:r>
     </w:p>
     <w:p>
@@ -4566,7 +4806,7 @@
           <w:color w:val="4A5568"/>
           <w:sz w:val="21"/>
         </w:rPr>
-        <w:t>Formulaire de cadrage préalable : Tout clic sur l'offre Entreprise redirige vers /commercial?intent=enterprise, imposant la saisie de 7 informations de qualification (Barreau de rattachement, taille du cabinet, volumétrie mensuelle, besoins d'intégration). Le prospect est enregistré en base dans la table commercial_leads.</w:t>
+        <w:t>Rupture du libre-service (Self-Service) : Tout clic sur l'offre Entreprise redirige obligatoirement vers /commercial?intent=enterprise, imposant la saisie de 7 informations de qualification vérifiables (Nom, email pro, téléphone direct, cabinet, ville et barreau, nombre d'avocats, cadrage du besoin). La demande est enregistrée dans la table PostgreSQL commercial_leads.</w:t>
       </w:r>
     </w:p>
     <w:p>
@@ -4582,7 +4822,7 @@
           <w:color w:val="4A5568"/>
           <w:sz w:val="21"/>
         </w:rPr>
-        <w:t>Pilier 1 — KYC léger déontologique : Avant toute ouverture d'accès à l'essai Entreprise, l'équipe commerciale vérifie l'inscription effective du demandeur au tableau officiel de l'Ordre des Avocats du Barreau concerné, conformément à la loi n° 28-08.</w:t>
+        <w:t>Pilier 1 — KYC léger déontologique : Conformément à la loi n° 28-08 régissant la profession d'avocat au Maroc, l'équipe commerciale vérifie l'inscription effective du demandeur au tableau officiel de l'Ordre des Avocats du Barreau déclaré. Tout demandeur fictif est immédiatement écarté.</w:t>
       </w:r>
     </w:p>
     <w:p>
@@ -4598,7 +4838,24 @@
           <w:color w:val="4A5568"/>
           <w:sz w:val="21"/>
         </w:rPr>
-        <w:t>Pilier 2 — Double Verrou (Durée &amp; Plafond) : La durée de l'essai Entreprise est fixée à 7 jours seulement (accélérant le cycle de vente PLG), et son plafond d'utilisation est bridé à 1 800 crédits (au lieu des 5 000 crédits du forfait payant actif), protégeant l'entreprise d'accueil contre des coûts LLM disproportionnés.</w:t>
+        <w:t>Pilier 2 — Double Verrou (Durée &amp; Plafond) : L'essai pilote est resserré à 7 jours seulement (créant une dynamique d'évaluation active sur 2-3 dossiers réels), et son plafond d'utilisation est strictement bridé à 1 800 crédits (au lieu des 5 000 crédits du forfait payant actif), protégeant l'entreprise d'accueil contre des coûts LLM disproportionnés.</w:t>
+      </w:r>
+    </w:p>
+    <w:p>
+      <w:pPr>
+        <w:pStyle w:val="Heading2"/>
+        <w:keepNext/>
+        <w:spacing w:before="240" w:after="100"/>
+      </w:pPr>
+      <w:r>
+        <w:rPr>
+          <w:rFonts w:ascii="Calibri" w:hAnsi="Calibri" w:eastAsia="Calibri"/>
+          <w:b/>
+          <w:i w:val="0"/>
+          <w:color w:val="0B1A4D"/>
+          <w:sz w:val="26"/>
+        </w:rPr>
+        <w:t>5.5 Stratégie de croissance globale (Growth Plan) et Unit Economics</w:t>
       </w:r>
     </w:p>
     <w:p>
@@ -4613,29 +4870,13 @@
           <w:color w:val="4A5568"/>
           <w:sz w:val="22"/>
         </w:rPr>
-        <w:t>Palier 5 « Sur mesure » : Pour les structures d'envergure nationale ou internationale dépassant 15 avocats, une offre personnalisée sur devis est proposée (déploiement sur infrastructure dédiée, intégration sur mesure avec les ERP juridiques internes).</w:t>
+        <w:t>La viabilité commerciale de LexHub s'appuie sur une mécanique de croissance en trois temps articulée avec une rentabilité unitaire élevée :</w:t>
       </w:r>
     </w:p>
     <w:p>
       <w:pPr>
-        <w:pStyle w:val="Heading2"/>
-        <w:keepNext/>
-        <w:spacing w:before="240" w:after="100"/>
-      </w:pPr>
-      <w:r>
-        <w:rPr>
-          <w:rFonts w:ascii="Calibri" w:hAnsi="Calibri" w:eastAsia="Calibri"/>
-          <w:b/>
-          <w:i w:val="0"/>
-          <w:color w:val="0B1A4D"/>
-          <w:sz w:val="26"/>
-        </w:rPr>
-        <w:t>5.4 Packs de crédits prépayés et sièges additionnels</w:t>
-      </w:r>
-    </w:p>
-    <w:p>
-      <w:pPr>
-        <w:spacing w:before="0" w:after="120" w:line="276" w:lineRule="auto"/>
+        <w:pStyle w:val="ListBullet"/>
+        <w:spacing w:after="60" w:line="276" w:lineRule="auto"/>
       </w:pPr>
       <w:r>
         <w:rPr>
@@ -4643,31 +4884,15 @@
           <w:b w:val="0"/>
           <w:i w:val="0"/>
           <w:color w:val="4A5568"/>
-          <w:sz w:val="22"/>
+          <w:sz w:val="21"/>
         </w:rPr>
-        <w:t>Les packs de crédits (500 crédits à 110 MAD, 1 000 crédits à 200 MAD, 2 500 crédits à 450 MAD) sont strictement réservés aux cabinets disposant d'un abonnement payant actif (accès bloqué avec code HTTP 403 en période d'essai). Ils sont gérés selon la règle comptable FIFO (First In, First Out) avec une validité de 12 mois. Par ailleurs, le plan Cabinet permet l'ajout de sièges collaborateurs à la carte (99 MAD / mois / avocat supplémentaire), évitant au cabinet de basculer prématurément sur le palier Entreprise.</w:t>
+        <w:t>Entonnoir Product-Led Growth (PLG) : L'expérience utilisateur immédiate (Time-to-Value &lt; 3 minutes) convertit les visiteurs en utilisateurs Découverte, qui découvrent naturellement la valeur sur un cas concret avant de basculer vers un essai Solo ou Cabinet.</w:t>
       </w:r>
     </w:p>
     <w:p>
       <w:pPr>
-        <w:pStyle w:val="Heading2"/>
-        <w:keepNext/>
-        <w:spacing w:before="240" w:after="100"/>
-      </w:pPr>
-      <w:r>
-        <w:rPr>
-          <w:rFonts w:ascii="Calibri" w:hAnsi="Calibri" w:eastAsia="Calibri"/>
-          <w:b/>
-          <w:i w:val="0"/>
-          <w:color w:val="0B1A4D"/>
-          <w:sz w:val="26"/>
-        </w:rPr>
-        <w:t>5.5 Programme de parrainage confraternel</w:t>
-      </w:r>
-    </w:p>
-    <w:p>
-      <w:pPr>
-        <w:spacing w:before="0" w:after="120" w:line="276" w:lineRule="auto"/>
+        <w:pStyle w:val="ListBullet"/>
+        <w:spacing w:after="60" w:line="276" w:lineRule="auto"/>
       </w:pPr>
       <w:r>
         <w:rPr>
@@ -4675,9 +4900,41 @@
           <w:b w:val="0"/>
           <w:i w:val="0"/>
           <w:color w:val="4A5568"/>
-          <w:sz w:val="22"/>
+          <w:sz w:val="21"/>
         </w:rPr>
-        <w:t>Chaque cabinet dispose d'un code unique de parrainage (ex. LH-CAS-8842). Lorsqu'un cabinet confrère s'inscrit via ce code, le filleul bénéficie de +14 jours d'essai supplémentaires, et le parrain reçoit un bonus de +30 jours d'abonnement gratuit dès lors que le filleul effectue son premier paiement réel. Ce mécanisme favorise une croissance organique virale au sein des barreaux marocains.</w:t>
+        <w:t>Expansion du panier moyen (Land &amp; Expand) : Les abonnés actifs augmentent leur valeur vie (LTV) par l'achat de packs prépayés FIFO valables 12 mois (500 crédits à 110 MAD, 1 000 à 200 MAD, 2 500 à 450 MAD) et par l'ajout de sièges collaborateurs à la carte (99 MAD / mois).</w:t>
+      </w:r>
+    </w:p>
+    <w:p>
+      <w:pPr>
+        <w:pStyle w:val="ListBullet"/>
+        <w:spacing w:after="60" w:line="276" w:lineRule="auto"/>
+      </w:pPr>
+      <w:r>
+        <w:rPr>
+          <w:rFonts w:ascii="Calibri" w:hAnsi="Calibri" w:eastAsia="Calibri"/>
+          <w:b w:val="0"/>
+          <w:i w:val="0"/>
+          <w:color w:val="4A5568"/>
+          <w:sz w:val="21"/>
+        </w:rPr>
+        <w:t>Moteur viral de parrainage confraternel : Grâce à un code unique par cabinet (ex. LH-CAS-8842), le filleul bénéficie de +14 jours d'essai offerts, et le parrain reçoit +30 jours d'abonnement gratuit crédités automatiquement au premier paiement du filleul (plafond de 12 parrainages/an).</w:t>
+      </w:r>
+    </w:p>
+    <w:p>
+      <w:pPr>
+        <w:pStyle w:val="ListBullet"/>
+        <w:spacing w:after="60" w:line="276" w:lineRule="auto"/>
+      </w:pPr>
+      <w:r>
+        <w:rPr>
+          <w:rFonts w:ascii="Calibri" w:hAnsi="Calibri" w:eastAsia="Calibri"/>
+          <w:b w:val="0"/>
+          <w:i w:val="0"/>
+          <w:color w:val="4A5568"/>
+          <w:sz w:val="21"/>
+        </w:rPr>
+        <w:t>Maîtrise des COGS et marge brute de 80% : Grâce à la reconnaissance vocale Web Speech API locale (zéro coût serveur) et à l'optimisation des prompts LLM, le coût direct d'une plaidoirie complète est inférieur à 0,70 MAD, garantissant une marge brute de plus de 80% pour l'entreprise d'accueil WEBVOICE dès quelques dizaines de cabinets abonnés.</w:t>
       </w:r>
     </w:p>
     <w:p>

</xml_diff>

<commit_message>
docs(bdd): document exhaustive 29-table PostgreSQL relational schema in LaTeX and Word
</commit_message>
<xml_diff>
--- a/docs/livraison-encadrant-2026/01_Rapport_PFA_LexHub.docx
+++ b/docs/livraison-encadrant-2026/01_Rapport_PFA_LexHub.docx
@@ -3503,7 +3503,7 @@
           <w:color w:val="0B1A4D"/>
           <w:sz w:val="26"/>
         </w:rPr>
-        <w:t>4.2 Architecture des données et modèle relationnel</w:t>
+        <w:t>4.2 Architecture des données et modèle relationnel (29 tables)</w:t>
       </w:r>
     </w:p>
     <w:p>
@@ -3518,8 +3518,558 @@
           <w:color w:val="4A5568"/>
           <w:sz w:val="22"/>
         </w:rPr>
-        <w:t>Le modèle de données est structuré autour du concept central de Cabinet (locataire SaaS). Chaque table applicative (users, cases, plaidoirie_drafts, documents, agenda_events, cabinet_notifications) intègre une clé étrangère cabinet_id indexée, garantissant l'étanchéité des requêtes SQL.</w:t>
+        <w:t>Contrairement aux projets d'étude simplistes reposant sur quelques tables isolées, la base de données relationnelle PostgreSQL 15 de LexHub intègre 29 tables métier rigoureusement normalisées (3e Forme Normale - 3NF), complétées par la table technique alembic_version. Aucune table n'est orpheline : chaque entité correspond à une exigence métier concrète (sécurité, déontologie, gestion judiciaire, pipeline d'IA, facturation SaaS et conformité légale). Le modèle garantit un cloisonnement multi-tenant absolu grâce à la clé étrangère cabinet_id indexée sur toutes les tables d'affaires.</w:t>
       </w:r>
+    </w:p>
+    <w:tbl>
+      <w:tblPr>
+        <w:tblStyle w:val="TableGrid"/>
+        <w:tblW w:type="auto" w:w="0"/>
+        <w:jc w:val="center"/>
+        <w:tblLook w:firstColumn="1" w:firstRow="1" w:lastColumn="0" w:lastRow="0" w:noHBand="0" w:noVBand="1" w:val="04A0"/>
+      </w:tblPr>
+      <w:tblGrid>
+        <w:gridCol w:w="3286"/>
+        <w:gridCol w:w="3286"/>
+        <w:gridCol w:w="3286"/>
+      </w:tblGrid>
+      <w:tr>
+        <w:tc>
+          <w:tcPr>
+            <w:tcW w:type="dxa" w:w="2268"/>
+            <w:shd w:fill="0B1A4D" w:val="clear"/>
+          </w:tcPr>
+          <w:p>
+            <w:pPr>
+              <w:spacing w:after="60" w:before="60"/>
+            </w:pPr>
+            <w:r/>
+            <w:r>
+              <w:rPr>
+                <w:rFonts w:ascii="Calibri" w:hAnsi="Calibri" w:eastAsia="Calibri"/>
+                <w:b/>
+                <w:i w:val="0"/>
+                <w:color w:val="FFFFFF"/>
+                <w:sz w:val="19"/>
+              </w:rPr>
+              <w:t>Sous-système fonctionnel</w:t>
+            </w:r>
+          </w:p>
+        </w:tc>
+        <w:tc>
+          <w:tcPr>
+            <w:tcW w:type="dxa" w:w="2835"/>
+            <w:shd w:fill="0B1A4D" w:val="clear"/>
+          </w:tcPr>
+          <w:p>
+            <w:pPr>
+              <w:spacing w:after="60" w:before="60"/>
+            </w:pPr>
+            <w:r/>
+            <w:r>
+              <w:rPr>
+                <w:rFonts w:ascii="Calibri" w:hAnsi="Calibri" w:eastAsia="Calibri"/>
+                <w:b/>
+                <w:i w:val="0"/>
+                <w:color w:val="FFFFFF"/>
+                <w:sz w:val="19"/>
+              </w:rPr>
+              <w:t>Tables PostgreSQL associées</w:t>
+            </w:r>
+          </w:p>
+        </w:tc>
+        <w:tc>
+          <w:tcPr>
+            <w:tcW w:type="dxa" w:w="4252"/>
+            <w:shd w:fill="0B1A4D" w:val="clear"/>
+          </w:tcPr>
+          <w:p>
+            <w:pPr>
+              <w:spacing w:after="60" w:before="60"/>
+            </w:pPr>
+            <w:r/>
+            <w:r>
+              <w:rPr>
+                <w:rFonts w:ascii="Calibri" w:hAnsi="Calibri" w:eastAsia="Calibri"/>
+                <w:b/>
+                <w:i w:val="0"/>
+                <w:color w:val="FFFFFF"/>
+                <w:sz w:val="19"/>
+              </w:rPr>
+              <w:t>Rôle et justification métier</w:t>
+            </w:r>
+          </w:p>
+        </w:tc>
+      </w:tr>
+      <w:tr>
+        <w:tc>
+          <w:tcPr>
+            <w:tcW w:type="dxa" w:w="2268"/>
+          </w:tcPr>
+          <w:p>
+            <w:pPr>
+              <w:spacing w:after="60" w:before="60"/>
+            </w:pPr>
+            <w:r/>
+            <w:r>
+              <w:rPr>
+                <w:rFonts w:ascii="Calibri" w:hAnsi="Calibri" w:eastAsia="Calibri"/>
+                <w:b w:val="0"/>
+                <w:i w:val="0"/>
+                <w:color w:val="1F2937"/>
+                <w:sz w:val="18"/>
+              </w:rPr>
+              <w:t>1. Multi-Tenancy &amp; Gouvernance</w:t>
+            </w:r>
+          </w:p>
+        </w:tc>
+        <w:tc>
+          <w:tcPr>
+            <w:tcW w:type="dxa" w:w="2835"/>
+          </w:tcPr>
+          <w:p>
+            <w:pPr>
+              <w:spacing w:after="60" w:before="60"/>
+            </w:pPr>
+            <w:r/>
+            <w:r>
+              <w:rPr>
+                <w:rFonts w:ascii="Calibri" w:hAnsi="Calibri" w:eastAsia="Calibri"/>
+                <w:b w:val="0"/>
+                <w:i w:val="0"/>
+                <w:color w:val="1F2937"/>
+                <w:sz w:val="18"/>
+              </w:rPr>
+              <w:t>cabinets, cabinet_invites, membership_requests, cabinet_notifications</w:t>
+            </w:r>
+          </w:p>
+        </w:tc>
+        <w:tc>
+          <w:tcPr>
+            <w:tcW w:type="dxa" w:w="4252"/>
+          </w:tcPr>
+          <w:p>
+            <w:pPr>
+              <w:spacing w:after="60" w:before="60"/>
+            </w:pPr>
+            <w:r/>
+            <w:r>
+              <w:rPr>
+                <w:rFonts w:ascii="Calibri" w:hAnsi="Calibri" w:eastAsia="Calibri"/>
+                <w:b w:val="0"/>
+                <w:i w:val="0"/>
+                <w:color w:val="1F2937"/>
+                <w:sz w:val="18"/>
+              </w:rPr>
+              <w:t>Isolation étanche des cabinets, charte graphique, codes d'adhésion d'équipe, invitations sécurisées et notifications internes.</w:t>
+            </w:r>
+          </w:p>
+        </w:tc>
+      </w:tr>
+      <w:tr>
+        <w:tc>
+          <w:tcPr>
+            <w:tcW w:type="dxa" w:w="2268"/>
+            <w:shd w:fill="F8FAFC" w:val="clear"/>
+          </w:tcPr>
+          <w:p>
+            <w:pPr>
+              <w:spacing w:after="60" w:before="60"/>
+            </w:pPr>
+            <w:r/>
+            <w:r>
+              <w:rPr>
+                <w:rFonts w:ascii="Calibri" w:hAnsi="Calibri" w:eastAsia="Calibri"/>
+                <w:b w:val="0"/>
+                <w:i w:val="0"/>
+                <w:color w:val="1F2937"/>
+                <w:sz w:val="18"/>
+              </w:rPr>
+              <w:t>2. Sécurité &amp; Authentification</w:t>
+            </w:r>
+          </w:p>
+        </w:tc>
+        <w:tc>
+          <w:tcPr>
+            <w:tcW w:type="dxa" w:w="2835"/>
+            <w:shd w:fill="F8FAFC" w:val="clear"/>
+          </w:tcPr>
+          <w:p>
+            <w:pPr>
+              <w:spacing w:after="60" w:before="60"/>
+            </w:pPr>
+            <w:r/>
+            <w:r>
+              <w:rPr>
+                <w:rFonts w:ascii="Calibri" w:hAnsi="Calibri" w:eastAsia="Calibri"/>
+                <w:b w:val="0"/>
+                <w:i w:val="0"/>
+                <w:color w:val="1F2937"/>
+                <w:sz w:val="18"/>
+              </w:rPr>
+              <w:t>users, auth_sessions, email_otps, email_tokens, mfa_recovery_codes</w:t>
+            </w:r>
+          </w:p>
+        </w:tc>
+        <w:tc>
+          <w:tcPr>
+            <w:tcW w:type="dxa" w:w="4252"/>
+            <w:shd w:fill="F8FAFC" w:val="clear"/>
+          </w:tcPr>
+          <w:p>
+            <w:pPr>
+              <w:spacing w:after="60" w:before="60"/>
+            </w:pPr>
+            <w:r/>
+            <w:r>
+              <w:rPr>
+                <w:rFonts w:ascii="Calibri" w:hAnsi="Calibri" w:eastAsia="Calibri"/>
+                <w:b w:val="0"/>
+                <w:i w:val="0"/>
+                <w:color w:val="1F2937"/>
+                <w:sz w:val="18"/>
+              </w:rPr>
+              <w:t>Comptes utilisateurs (avocat, assistant, admin), rotation et révocation des refresh tokens JWT, OTP par email (6 chiffres) et MFA.</w:t>
+            </w:r>
+          </w:p>
+        </w:tc>
+      </w:tr>
+      <w:tr>
+        <w:tc>
+          <w:tcPr>
+            <w:tcW w:type="dxa" w:w="2268"/>
+          </w:tcPr>
+          <w:p>
+            <w:pPr>
+              <w:spacing w:after="60" w:before="60"/>
+            </w:pPr>
+            <w:r/>
+            <w:r>
+              <w:rPr>
+                <w:rFonts w:ascii="Calibri" w:hAnsi="Calibri" w:eastAsia="Calibri"/>
+                <w:b w:val="0"/>
+                <w:i w:val="0"/>
+                <w:color w:val="1F2937"/>
+                <w:sz w:val="18"/>
+              </w:rPr>
+              <w:t>3. Gestion Juridique &amp; Dossiers</w:t>
+            </w:r>
+          </w:p>
+        </w:tc>
+        <w:tc>
+          <w:tcPr>
+            <w:tcW w:type="dxa" w:w="2835"/>
+          </w:tcPr>
+          <w:p>
+            <w:pPr>
+              <w:spacing w:after="60" w:before="60"/>
+            </w:pPr>
+            <w:r/>
+            <w:r>
+              <w:rPr>
+                <w:rFonts w:ascii="Calibri" w:hAnsi="Calibri" w:eastAsia="Calibri"/>
+                <w:b w:val="0"/>
+                <w:i w:val="0"/>
+                <w:color w:val="1F2937"/>
+                <w:sz w:val="18"/>
+              </w:rPr>
+              <w:t>cases, case_notes, case_tasks, case_comments, agenda_events</w:t>
+            </w:r>
+          </w:p>
+        </w:tc>
+        <w:tc>
+          <w:tcPr>
+            <w:tcW w:type="dxa" w:w="4252"/>
+          </w:tcPr>
+          <w:p>
+            <w:pPr>
+              <w:spacing w:after="60" w:before="60"/>
+            </w:pPr>
+            <w:r/>
+            <w:r>
+              <w:rPr>
+                <w:rFonts w:ascii="Calibri" w:hAnsi="Calibri" w:eastAsia="Calibri"/>
+                <w:b w:val="0"/>
+                <w:i w:val="0"/>
+                <w:color w:val="1F2937"/>
+                <w:sz w:val="18"/>
+              </w:rPr>
+              <w:t>Fiches dossiers (art. 32 CPC, n° RG, chambre, juge), notes d'audience, planning de tâches, commentaires d'équipe et agenda des délais de recours.</w:t>
+            </w:r>
+          </w:p>
+        </w:tc>
+      </w:tr>
+      <w:tr>
+        <w:tc>
+          <w:tcPr>
+            <w:tcW w:type="dxa" w:w="2268"/>
+            <w:shd w:fill="F8FAFC" w:val="clear"/>
+          </w:tcPr>
+          <w:p>
+            <w:pPr>
+              <w:spacing w:after="60" w:before="60"/>
+            </w:pPr>
+            <w:r/>
+            <w:r>
+              <w:rPr>
+                <w:rFonts w:ascii="Calibri" w:hAnsi="Calibri" w:eastAsia="Calibri"/>
+                <w:b w:val="0"/>
+                <w:i w:val="0"/>
+                <w:color w:val="1F2937"/>
+                <w:sz w:val="18"/>
+              </w:rPr>
+              <w:t>4. Atelier de Plaidoirie &amp; IA</w:t>
+            </w:r>
+          </w:p>
+        </w:tc>
+        <w:tc>
+          <w:tcPr>
+            <w:tcW w:type="dxa" w:w="2835"/>
+            <w:shd w:fill="F8FAFC" w:val="clear"/>
+          </w:tcPr>
+          <w:p>
+            <w:pPr>
+              <w:spacing w:after="60" w:before="60"/>
+            </w:pPr>
+            <w:r/>
+            <w:r>
+              <w:rPr>
+                <w:rFonts w:ascii="Calibri" w:hAnsi="Calibri" w:eastAsia="Calibri"/>
+                <w:b w:val="0"/>
+                <w:i w:val="0"/>
+                <w:color w:val="1F2937"/>
+                <w:sz w:val="18"/>
+              </w:rPr>
+              <w:t>plaidoirie_drafts, plaidoirie_revisions, cabinet_plaidoirie_templates, documents</w:t>
+            </w:r>
+          </w:p>
+        </w:tc>
+        <w:tc>
+          <w:tcPr>
+            <w:tcW w:type="dxa" w:w="4252"/>
+            <w:shd w:fill="F8FAFC" w:val="clear"/>
+          </w:tcPr>
+          <w:p>
+            <w:pPr>
+              <w:spacing w:after="60" w:before="60"/>
+            </w:pPr>
+            <w:r/>
+            <w:r>
+              <w:rPr>
+                <w:rFonts w:ascii="Calibri" w:hAnsi="Calibri" w:eastAsia="Calibri"/>
+                <w:b w:val="0"/>
+                <w:i w:val="0"/>
+                <w:color w:val="1F2937"/>
+                <w:sz w:val="18"/>
+              </w:rPr>
+              <w:t>Cycle de vie des conclusions (brouillon -&gt; validé -&gt; finalisé), historique des versions, modèles réutilisables et pièces scannées avec OCR MinIO.</w:t>
+            </w:r>
+          </w:p>
+        </w:tc>
+      </w:tr>
+      <w:tr>
+        <w:tc>
+          <w:tcPr>
+            <w:tcW w:type="dxa" w:w="2268"/>
+          </w:tcPr>
+          <w:p>
+            <w:pPr>
+              <w:spacing w:after="60" w:before="60"/>
+            </w:pPr>
+            <w:r/>
+            <w:r>
+              <w:rPr>
+                <w:rFonts w:ascii="Calibri" w:hAnsi="Calibri" w:eastAsia="Calibri"/>
+                <w:b w:val="0"/>
+                <w:i w:val="0"/>
+                <w:color w:val="1F2937"/>
+                <w:sz w:val="18"/>
+              </w:rPr>
+              <w:t>5. Monétisation &amp; Facturation SaaS</w:t>
+            </w:r>
+          </w:p>
+        </w:tc>
+        <w:tc>
+          <w:tcPr>
+            <w:tcW w:type="dxa" w:w="2835"/>
+          </w:tcPr>
+          <w:p>
+            <w:pPr>
+              <w:spacing w:after="60" w:before="60"/>
+            </w:pPr>
+            <w:r/>
+            <w:r>
+              <w:rPr>
+                <w:rFonts w:ascii="Calibri" w:hAnsi="Calibri" w:eastAsia="Calibri"/>
+                <w:b w:val="0"/>
+                <w:i w:val="0"/>
+                <w:color w:val="1F2937"/>
+                <w:sz w:val="18"/>
+              </w:rPr>
+              <w:t>subscription_plans, cabinet_subscriptions, billing_credit_pack_purchases, billing_invoices, usage_counters, cabinet_referrals, payment_transfer_requests</w:t>
+            </w:r>
+          </w:p>
+        </w:tc>
+        <w:tc>
+          <w:tcPr>
+            <w:tcW w:type="dxa" w:w="4252"/>
+          </w:tcPr>
+          <w:p>
+            <w:pPr>
+              <w:spacing w:after="60" w:before="60"/>
+            </w:pPr>
+            <w:r/>
+            <w:r>
+              <w:rPr>
+                <w:rFonts w:ascii="Calibri" w:hAnsi="Calibri" w:eastAsia="Calibri"/>
+                <w:b w:val="0"/>
+                <w:i w:val="0"/>
+                <w:color w:val="1F2937"/>
+                <w:sz w:val="18"/>
+              </w:rPr>
+              <w:t>Catalogue des forfaits (Découverte, Solo, Cabinet, Entreprise), abonnements, packs de crédits FIFO (12 mois), factures, compteurs de quotas et parrainage.</w:t>
+            </w:r>
+          </w:p>
+        </w:tc>
+      </w:tr>
+      <w:tr>
+        <w:tc>
+          <w:tcPr>
+            <w:tcW w:type="dxa" w:w="2268"/>
+            <w:shd w:fill="F8FAFC" w:val="clear"/>
+          </w:tcPr>
+          <w:p>
+            <w:pPr>
+              <w:spacing w:after="60" w:before="60"/>
+            </w:pPr>
+            <w:r/>
+            <w:r>
+              <w:rPr>
+                <w:rFonts w:ascii="Calibri" w:hAnsi="Calibri" w:eastAsia="Calibri"/>
+                <w:b w:val="0"/>
+                <w:i w:val="0"/>
+                <w:color w:val="1F2937"/>
+                <w:sz w:val="18"/>
+              </w:rPr>
+              <w:t>6. Qualification Commerciale</w:t>
+            </w:r>
+          </w:p>
+        </w:tc>
+        <w:tc>
+          <w:tcPr>
+            <w:tcW w:type="dxa" w:w="2835"/>
+            <w:shd w:fill="F8FAFC" w:val="clear"/>
+          </w:tcPr>
+          <w:p>
+            <w:pPr>
+              <w:spacing w:after="60" w:before="60"/>
+            </w:pPr>
+            <w:r/>
+            <w:r>
+              <w:rPr>
+                <w:rFonts w:ascii="Calibri" w:hAnsi="Calibri" w:eastAsia="Calibri"/>
+                <w:b w:val="0"/>
+                <w:i w:val="0"/>
+                <w:color w:val="1F2937"/>
+                <w:sz w:val="18"/>
+              </w:rPr>
+              <w:t>commercial_leads</w:t>
+            </w:r>
+          </w:p>
+        </w:tc>
+        <w:tc>
+          <w:tcPr>
+            <w:tcW w:type="dxa" w:w="4252"/>
+            <w:shd w:fill="F8FAFC" w:val="clear"/>
+          </w:tcPr>
+          <w:p>
+            <w:pPr>
+              <w:spacing w:after="60" w:before="60"/>
+            </w:pPr>
+            <w:r/>
+            <w:r>
+              <w:rPr>
+                <w:rFonts w:ascii="Calibri" w:hAnsi="Calibri" w:eastAsia="Calibri"/>
+                <w:b w:val="0"/>
+                <w:i w:val="0"/>
+                <w:color w:val="1F2937"/>
+                <w:sz w:val="18"/>
+              </w:rPr>
+              <w:t>Recueil et traitement des 7 critères de qualification pour l'offre Entreprise et les devis personnalisés Sur mesure.</w:t>
+            </w:r>
+          </w:p>
+        </w:tc>
+      </w:tr>
+      <w:tr>
+        <w:tc>
+          <w:tcPr>
+            <w:tcW w:type="dxa" w:w="2268"/>
+          </w:tcPr>
+          <w:p>
+            <w:pPr>
+              <w:spacing w:after="60" w:before="60"/>
+            </w:pPr>
+            <w:r/>
+            <w:r>
+              <w:rPr>
+                <w:rFonts w:ascii="Calibri" w:hAnsi="Calibri" w:eastAsia="Calibri"/>
+                <w:b w:val="0"/>
+                <w:i w:val="0"/>
+                <w:color w:val="1F2937"/>
+                <w:sz w:val="18"/>
+              </w:rPr>
+              <w:t>7. Traçabilité &amp; Rétention Légale</w:t>
+            </w:r>
+          </w:p>
+        </w:tc>
+        <w:tc>
+          <w:tcPr>
+            <w:tcW w:type="dxa" w:w="2835"/>
+          </w:tcPr>
+          <w:p>
+            <w:pPr>
+              <w:spacing w:after="60" w:before="60"/>
+            </w:pPr>
+            <w:r/>
+            <w:r>
+              <w:rPr>
+                <w:rFonts w:ascii="Calibri" w:hAnsi="Calibri" w:eastAsia="Calibri"/>
+                <w:b w:val="0"/>
+                <w:i w:val="0"/>
+                <w:color w:val="1F2937"/>
+                <w:sz w:val="18"/>
+              </w:rPr>
+              <w:t>audit_logs, activity_archives, admin_audit_archives</w:t>
+            </w:r>
+          </w:p>
+        </w:tc>
+        <w:tc>
+          <w:tcPr>
+            <w:tcW w:type="dxa" w:w="4252"/>
+          </w:tcPr>
+          <w:p>
+            <w:pPr>
+              <w:spacing w:after="60" w:before="60"/>
+            </w:pPr>
+            <w:r/>
+            <w:r>
+              <w:rPr>
+                <w:rFonts w:ascii="Calibri" w:hAnsi="Calibri" w:eastAsia="Calibri"/>
+                <w:b w:val="0"/>
+                <w:i w:val="0"/>
+                <w:color w:val="1F2937"/>
+                <w:sz w:val="18"/>
+              </w:rPr>
+              <w:t>Journal d'audit immuable (art. 30 Loi 28-08) et archivage automatique à 90 jours pour préserver la performance de la base de données.</w:t>
+            </w:r>
+          </w:p>
+        </w:tc>
+      </w:tr>
+    </w:tbl>
+    <w:p>
+      <w:pPr>
+        <w:spacing w:after="80"/>
+      </w:pPr>
     </w:p>
     <w:p>
       <w:pPr>

</xml_diff>

<commit_message>
Ship LexHub polish: invoices PDF, mobile docks, dictation, and PFA docs.
</commit_message>
<xml_diff>
--- a/docs/livraison-encadrant-2026/01_Rapport_PFA_LexHub.docx
+++ b/docs/livraison-encadrant-2026/01_Rapport_PFA_LexHub.docx
@@ -856,7 +856,7 @@
           <w:color w:val="4A5568"/>
           <w:sz w:val="22"/>
         </w:rPr>
-        <w:t>Partant du constat d'une forte perte de productivité lors de la transition orale-écrite des arguments de plaidoirie, LexHub met en place un atelier en cinq étapes : rattachement du dossier et des pièces justificatives, dictée vocale temps réel via la Web Speech API native du navigateur (respectant la confidentialité locale sans coût serveur), transcription avec détection visuelle des corrections et détection déterministe des contradictions matérielles, rédaction assistée structurée selon les usages des juridictions marocaines, et export final exclusif au format Microsoft Word (.docx) 100 % éditable, orné de l'en-tête officiel du cabinet et des armoiries du Royaume du Maroc.</w:t>
+        <w:t>Partant du constat d'une forte perte de productivité lors de la transition orale-écrite des arguments de plaidoirie, LexHub met en place un atelier en cinq étapes : rattachement du dossier et des pièces justificatives, dictée vocale (Web Speech API et/ou Whisper OpenAI, détection automatique français/arabe), transcription avec correction de forme tolérante aux fautes et détection des contradictions, clarification QCM optionnelle puis rédaction assistée structurée selon les usages des juridictions marocaines, révision interactive (chat qui répond et met à jour le document), et export final exclusif au format Microsoft Word (.docx) 100 % éditable, orné de l'en-tête officiel du cabinet et des armoiries du Royaume du Maroc.</w:t>
       </w:r>
     </w:p>
     <w:p>
@@ -2587,7 +2587,7 @@
                 <w:color w:val="1F2937"/>
                 <w:sz w:val="18"/>
               </w:rPr>
-              <w:t>Capture micro temps réel dans le navigateur (Web Speech API) avec affichage continu et reprise à tout instant.</w:t>
+              <w:t>Capture micro (Web Speech Chrome/Edge ou Whisper MediaRecorder, y compris Firefox) ; détection auto FR/AR ; import audio.</w:t>
             </w:r>
           </w:p>
         </w:tc>
@@ -2655,7 +2655,7 @@
                 <w:color w:val="1F2937"/>
                 <w:sz w:val="18"/>
               </w:rPr>
-              <w:t>Nettoyage typographique, correction de forme en arabe juridique avec mise en évidence visuelle orange des termes corrigés.</w:t>
+              <w:t>Correction de forme en arabe juridique, fautes STT approximées ; surlignage orange ; refus du texte sans sens.</w:t>
             </w:r>
           </w:p>
         </w:tc>
@@ -2766,7 +2766,7 @@
                 <w:color w:val="1F2937"/>
                 <w:sz w:val="18"/>
               </w:rPr>
-              <w:t>Rédaction assistée</w:t>
+              <w:t>Clarification QCM</w:t>
             </w:r>
           </w:p>
         </w:tc>
@@ -2788,7 +2788,7 @@
                 <w:color w:val="1F2937"/>
                 <w:sz w:val="18"/>
               </w:rPr>
-              <w:t>Génération de la plaidoirie en sections normalisées (En-tête, Faits constants, Moyens de droit, Prétentions chiffrées).</w:t>
+              <w:t>0 à 5 questions après lecture anonymisée du dossier et de la dictée ; l'avocat confirme ou passe avant rédaction.</w:t>
             </w:r>
           </w:p>
         </w:tc>
@@ -2832,7 +2832,7 @@
                 <w:color w:val="1F2937"/>
                 <w:sz w:val="18"/>
               </w:rPr>
-              <w:t>Assistant interactif</w:t>
+              <w:t>Rédaction assistée</w:t>
             </w:r>
           </w:p>
         </w:tc>
@@ -2853,7 +2853,7 @@
                 <w:color w:val="1F2937"/>
                 <w:sz w:val="18"/>
               </w:rPr>
-              <w:t>Module de révision guidée permettant à l'avocat d'affiner le texte ou de compléter une section par dialogue.</w:t>
+              <w:t>Génération de la plaidoirie en sections normalisées (أولاً…خامساً, لهذه الأسباب / الملتمسات) sans invention de faits.</w:t>
             </w:r>
           </w:p>
         </w:tc>
@@ -2899,7 +2899,7 @@
                 <w:color w:val="1F2937"/>
                 <w:sz w:val="18"/>
               </w:rPr>
-              <w:t>Export Word (.docx)</w:t>
+              <w:t>Assistant révision</w:t>
             </w:r>
           </w:p>
         </w:tc>
@@ -2921,7 +2921,7 @@
                 <w:color w:val="1F2937"/>
                 <w:sz w:val="18"/>
               </w:rPr>
-              <w:t>Génération du document officiel téléchargeable au format .docx, prêt pour impression ou dépôt au greffe.</w:t>
+              <w:t>Chat : répond pédagogiquement et met à jour le document ; Annuler / Modifier ; micro avec bouton Terminé.</w:t>
             </w:r>
           </w:p>
         </w:tc>
@@ -2965,7 +2965,7 @@
                 <w:color w:val="1F2937"/>
                 <w:sz w:val="18"/>
               </w:rPr>
-              <w:t>Collaboration étanche</w:t>
+              <w:t>Export Word (.docx)</w:t>
             </w:r>
           </w:p>
         </w:tc>
@@ -2986,7 +2986,7 @@
                 <w:color w:val="1F2937"/>
                 <w:sz w:val="18"/>
               </w:rPr>
-              <w:t>Masquage rigoureux des brouillons (draft) aux assistants ; accès réservé aux états validés (validated).</w:t>
+              <w:t>Génération du document officiel téléchargeable au format .docx, prêt pour impression ou dépôt au greffe.</w:t>
             </w:r>
           </w:p>
         </w:tc>
@@ -3032,7 +3032,7 @@
                 <w:color w:val="1F2937"/>
                 <w:sz w:val="18"/>
               </w:rPr>
-              <w:t>Planning &amp; Audiences</w:t>
+              <w:t>Collaboration étanche</w:t>
             </w:r>
           </w:p>
         </w:tc>
@@ -3054,7 +3054,7 @@
                 <w:color w:val="1F2937"/>
                 <w:sz w:val="18"/>
               </w:rPr>
-              <w:t>Gestion de l'agenda des audiences, synchronisation avec le dossier et rappels à J-2 (48h).</w:t>
+              <w:t>Masquage rigoureux des brouillons (draft) aux assistants ; accès réservé aux états validés (validated).</w:t>
             </w:r>
           </w:p>
         </w:tc>
@@ -3098,7 +3098,7 @@
                 <w:color w:val="1F2937"/>
                 <w:sz w:val="18"/>
               </w:rPr>
-              <w:t>Fil d'activité</w:t>
+              <w:t>Planning &amp; Audiences</w:t>
             </w:r>
           </w:p>
         </w:tc>
@@ -3119,7 +3119,7 @@
                 <w:color w:val="1F2937"/>
                 <w:sz w:val="18"/>
               </w:rPr>
-              <w:t>Journalisation transparente des actions sensibles au sein du cabinet pour l'audit interne.</w:t>
+              <w:t>Gestion de l'agenda des audiences, synchronisation avec le dossier et rappels à J-2 (48h).</w:t>
             </w:r>
           </w:p>
         </w:tc>
@@ -3165,6 +3165,72 @@
                 <w:color w:val="1F2937"/>
                 <w:sz w:val="18"/>
               </w:rPr>
+              <w:t>Fil d'activité</w:t>
+            </w:r>
+          </w:p>
+        </w:tc>
+        <w:tc>
+          <w:tcPr>
+            <w:tcW w:type="dxa" w:w="5386"/>
+            <w:shd w:fill="F8FAFC" w:val="clear"/>
+          </w:tcPr>
+          <w:p>
+            <w:pPr>
+              <w:spacing w:after="60" w:before="60"/>
+            </w:pPr>
+            <w:r/>
+            <w:r>
+              <w:rPr>
+                <w:rFonts w:ascii="Calibri" w:hAnsi="Calibri" w:eastAsia="Calibri"/>
+                <w:b w:val="0"/>
+                <w:i w:val="0"/>
+                <w:color w:val="1F2937"/>
+                <w:sz w:val="18"/>
+              </w:rPr>
+              <w:t>Journalisation transparente des actions sensibles au sein du cabinet pour l'audit interne.</w:t>
+            </w:r>
+          </w:p>
+        </w:tc>
+      </w:tr>
+      <w:tr>
+        <w:tc>
+          <w:tcPr>
+            <w:tcW w:type="dxa" w:w="1417"/>
+          </w:tcPr>
+          <w:p>
+            <w:pPr>
+              <w:spacing w:after="60" w:before="60"/>
+            </w:pPr>
+            <w:r/>
+            <w:r>
+              <w:rPr>
+                <w:rFonts w:ascii="Calibri" w:hAnsi="Calibri" w:eastAsia="Calibri"/>
+                <w:b w:val="0"/>
+                <w:i w:val="0"/>
+                <w:color w:val="1F2937"/>
+                <w:sz w:val="18"/>
+              </w:rPr>
+              <w:t>EF-13</w:t>
+            </w:r>
+          </w:p>
+        </w:tc>
+        <w:tc>
+          <w:tcPr>
+            <w:tcW w:type="dxa" w:w="2268"/>
+          </w:tcPr>
+          <w:p>
+            <w:pPr>
+              <w:spacing w:after="60" w:before="60"/>
+            </w:pPr>
+            <w:r/>
+            <w:r>
+              <w:rPr>
+                <w:rFonts w:ascii="Calibri" w:hAnsi="Calibri" w:eastAsia="Calibri"/>
+                <w:b w:val="0"/>
+                <w:i w:val="0"/>
+                <w:color w:val="1F2937"/>
+                <w:sz w:val="18"/>
+              </w:rPr>
               <w:t>Modèle économique</w:t>
             </w:r>
           </w:p>
@@ -3172,7 +3238,6 @@
         <w:tc>
           <w:tcPr>
             <w:tcW w:type="dxa" w:w="5386"/>
-            <w:shd w:fill="F8FAFC" w:val="clear"/>
           </w:tcPr>
           <w:p>
             <w:pPr>
@@ -4179,7 +4244,7 @@
           <w:color w:val="4A5568"/>
           <w:sz w:val="21"/>
         </w:rPr>
-        <w:t>Étape 2 — Dictée vocale : Enregistrement de la parole de l'avocat en arabe via la Web Speech API native du navigateur, avec indicateur de flux et transcription instantanée.</w:t>
+        <w:t>Étape 2 — Dictée vocale : Capture micro via Web Speech (Chrome/Edge) ou Whisper (MediaRecorder, Firefox inclus), ou import audio ; détection automatique français/arabe sans basculer toute l'interface.</w:t>
       </w:r>
     </w:p>
     <w:p>
@@ -4195,7 +4260,7 @@
           <w:color w:val="4A5568"/>
           <w:sz w:val="21"/>
         </w:rPr>
-        <w:t>Étape 3 — Transcription et correction de forme : Nettoyage automatique en arabe standard juridique (Fusha) ; mise en évidence des corrections par surlignage orange ; détection des contradictions matérielles.</w:t>
+        <w:t>Étape 3 — Transcription et correction de forme : Nettoyage en arabe standard juridique (Fusha), fautes de frappe/STT approximées ; surlignage orange ; contradictions matérielles ; feuille de clarification QCM (0–5) générée après anonymisation du dossier.</w:t>
       </w:r>
     </w:p>
     <w:p>
@@ -4211,7 +4276,7 @@
           <w:color w:val="4A5568"/>
           <w:sz w:val="21"/>
         </w:rPr>
-        <w:t>Étape 4 — Rédaction assistée : Structuration du texte selon les normes procédurales marocaines (En-tête de cour, Faits constants, Réfutation des prétentions adverses, Dispositif légal) ; affinement par dialogue interactif avec l'IA.</w:t>
+        <w:t>Étape 4 — Rédaction assistée et révision : Structuration (أولاً…خامساً, لهذه الأسباب) ; panneau Assistant IA (chat) qui répond et met à jour le document ; micro avec bandeau d'écoute et bouton Terminé ; Annuler / Modifier la requête.</w:t>
       </w:r>
     </w:p>
     <w:p>
@@ -7847,7 +7912,7 @@
           <w:color w:val="4A5568"/>
           <w:sz w:val="19"/>
         </w:rPr>
-        <w:t>Figure — Écran d'accueil public et proposition de valeur LexHub (https://lexhub.space)</w:t>
+        <w:t>Figure — Accueil LexHub (page publique)</w:t>
       </w:r>
     </w:p>
     <w:p>
@@ -7903,7 +7968,7 @@
           <w:color w:val="4A5568"/>
           <w:sz w:val="19"/>
         </w:rPr>
-        <w:t>Figure — Formulaire de connexion sécurisée avec authentification par session et JWT</w:t>
+        <w:t>Figure — Connexion sécurisée</w:t>
       </w:r>
     </w:p>
     <w:p>
@@ -7914,7 +7979,7 @@
       <w:r>
         <w:drawing>
           <wp:inline xmlns:a="http://schemas.openxmlformats.org/drawingml/2006/main" xmlns:pic="http://schemas.openxmlformats.org/drawingml/2006/picture">
-            <wp:extent cx="5220000" cy="4121625"/>
+            <wp:extent cx="5220000" cy="2599805"/>
             <wp:docPr id="6" name="Picture 6"/>
             <wp:cNvGraphicFramePr>
               <a:graphicFrameLocks noChangeAspect="1"/>
@@ -7935,7 +8000,7 @@
                   <pic:spPr>
                     <a:xfrm>
                       <a:off x="0" y="0"/>
-                      <a:ext cx="5220000" cy="4121625"/>
+                      <a:ext cx="5220000" cy="2599805"/>
                     </a:xfrm>
                     <a:prstGeom prst="rect"/>
                   </pic:spPr>
@@ -7959,7 +8024,7 @@
           <w:color w:val="4A5568"/>
           <w:sz w:val="19"/>
         </w:rPr>
-        <w:t>Figure — Tableau de bord principal du cabinet : métriques d'activité et accès rapide</w:t>
+        <w:t>Figure — Tableau de bord — dossiers, documents, essai et crédits</w:t>
       </w:r>
     </w:p>
     <w:p>
@@ -8015,7 +8080,7 @@
           <w:color w:val="4A5568"/>
           <w:sz w:val="19"/>
         </w:rPr>
-        <w:t>Figure — Gestionnaire des dossiers judiciaires avec filtres et recherche instantanée</w:t>
+        <w:t>Figure — Liste des dossiers du cabinet</w:t>
       </w:r>
     </w:p>
     <w:p>
@@ -8026,8 +8091,176 @@
       <w:r>
         <w:drawing>
           <wp:inline xmlns:a="http://schemas.openxmlformats.org/drawingml/2006/main" xmlns:pic="http://schemas.openxmlformats.org/drawingml/2006/picture">
-            <wp:extent cx="5220000" cy="3262500"/>
+            <wp:extent cx="5220000" cy="2553926"/>
             <wp:docPr id="8" name="Picture 8"/>
+            <wp:cNvGraphicFramePr>
+              <a:graphicFrameLocks noChangeAspect="1"/>
+            </wp:cNvGraphicFramePr>
+            <a:graphic>
+              <a:graphicData uri="http://schemas.openxmlformats.org/drawingml/2006/picture">
+                <pic:pic>
+                  <pic:nvPicPr>
+                    <pic:cNvPr id="0" name="24-dossier-detail.png"/>
+                    <pic:cNvPicPr/>
+                  </pic:nvPicPr>
+                  <pic:blipFill>
+                    <a:blip r:embed="rId17"/>
+                    <a:stretch>
+                      <a:fillRect/>
+                    </a:stretch>
+                  </pic:blipFill>
+                  <pic:spPr>
+                    <a:xfrm>
+                      <a:off x="0" y="0"/>
+                      <a:ext cx="5220000" cy="2553926"/>
+                    </a:xfrm>
+                    <a:prstGeom prst="rect"/>
+                  </pic:spPr>
+                </pic:pic>
+              </a:graphicData>
+            </a:graphic>
+          </wp:inline>
+        </w:drawing>
+      </w:r>
+    </w:p>
+    <w:p>
+      <w:pPr>
+        <w:spacing w:after="160"/>
+        <w:jc w:val="center"/>
+      </w:pPr>
+      <w:r>
+        <w:rPr>
+          <w:rFonts w:ascii="Calibri" w:hAnsi="Calibri" w:eastAsia="Calibri"/>
+          <w:b w:val="0"/>
+          <w:i/>
+          <w:color w:val="4A5568"/>
+          <w:sz w:val="19"/>
+        </w:rPr>
+        <w:t>Figure — Fiche dossier — identité des parties et plaidoirie liée</w:t>
+      </w:r>
+    </w:p>
+    <w:p>
+      <w:pPr>
+        <w:spacing w:before="160" w:after="60"/>
+        <w:jc w:val="center"/>
+      </w:pPr>
+      <w:r>
+        <w:drawing>
+          <wp:inline xmlns:a="http://schemas.openxmlformats.org/drawingml/2006/main" xmlns:pic="http://schemas.openxmlformats.org/drawingml/2006/picture">
+            <wp:extent cx="5220000" cy="2543730"/>
+            <wp:docPr id="9" name="Picture 9"/>
+            <wp:cNvGraphicFramePr>
+              <a:graphicFrameLocks noChangeAspect="1"/>
+            </wp:cNvGraphicFramePr>
+            <a:graphic>
+              <a:graphicData uri="http://schemas.openxmlformats.org/drawingml/2006/picture">
+                <pic:pic>
+                  <pic:nvPicPr>
+                    <pic:cNvPr id="0" name="13-documents.png"/>
+                    <pic:cNvPicPr/>
+                  </pic:nvPicPr>
+                  <pic:blipFill>
+                    <a:blip r:embed="rId18"/>
+                    <a:stretch>
+                      <a:fillRect/>
+                    </a:stretch>
+                  </pic:blipFill>
+                  <pic:spPr>
+                    <a:xfrm>
+                      <a:off x="0" y="0"/>
+                      <a:ext cx="5220000" cy="2543730"/>
+                    </a:xfrm>
+                    <a:prstGeom prst="rect"/>
+                  </pic:spPr>
+                </pic:pic>
+              </a:graphicData>
+            </a:graphic>
+          </wp:inline>
+        </w:drawing>
+      </w:r>
+    </w:p>
+    <w:p>
+      <w:pPr>
+        <w:spacing w:after="160"/>
+        <w:jc w:val="center"/>
+      </w:pPr>
+      <w:r>
+        <w:rPr>
+          <w:rFonts w:ascii="Calibri" w:hAnsi="Calibri" w:eastAsia="Calibri"/>
+          <w:b w:val="0"/>
+          <w:i/>
+          <w:color w:val="4A5568"/>
+          <w:sz w:val="19"/>
+        </w:rPr>
+        <w:t>Figure — Espace Documents — dépôt et statut d'extraction</w:t>
+      </w:r>
+    </w:p>
+    <w:p>
+      <w:pPr>
+        <w:spacing w:before="160" w:after="60"/>
+        <w:jc w:val="center"/>
+      </w:pPr>
+      <w:r>
+        <w:drawing>
+          <wp:inline xmlns:a="http://schemas.openxmlformats.org/drawingml/2006/main" xmlns:pic="http://schemas.openxmlformats.org/drawingml/2006/picture">
+            <wp:extent cx="5220000" cy="2615098"/>
+            <wp:docPr id="10" name="Picture 10"/>
+            <wp:cNvGraphicFramePr>
+              <a:graphicFrameLocks noChangeAspect="1"/>
+            </wp:cNvGraphicFramePr>
+            <a:graphic>
+              <a:graphicData uri="http://schemas.openxmlformats.org/drawingml/2006/picture">
+                <pic:pic>
+                  <pic:nvPicPr>
+                    <pic:cNvPr id="0" name="13b-document-detail.png"/>
+                    <pic:cNvPicPr/>
+                  </pic:nvPicPr>
+                  <pic:blipFill>
+                    <a:blip r:embed="rId19"/>
+                    <a:stretch>
+                      <a:fillRect/>
+                    </a:stretch>
+                  </pic:blipFill>
+                  <pic:spPr>
+                    <a:xfrm>
+                      <a:off x="0" y="0"/>
+                      <a:ext cx="5220000" cy="2615098"/>
+                    </a:xfrm>
+                    <a:prstGeom prst="rect"/>
+                  </pic:spPr>
+                </pic:pic>
+              </a:graphicData>
+            </a:graphic>
+          </wp:inline>
+        </w:drawing>
+      </w:r>
+    </w:p>
+    <w:p>
+      <w:pPr>
+        <w:spacing w:after="160"/>
+        <w:jc w:val="center"/>
+      </w:pPr>
+      <w:r>
+        <w:rPr>
+          <w:rFonts w:ascii="Calibri" w:hAnsi="Calibri" w:eastAsia="Calibri"/>
+          <w:b w:val="0"/>
+          <w:i/>
+          <w:color w:val="4A5568"/>
+          <w:sz w:val="19"/>
+        </w:rPr>
+        <w:t>Figure — Détail document — extrait, synthèse IA et questions</w:t>
+      </w:r>
+    </w:p>
+    <w:p>
+      <w:pPr>
+        <w:spacing w:before="160" w:after="60"/>
+        <w:jc w:val="center"/>
+      </w:pPr>
+      <w:r>
+        <w:drawing>
+          <wp:inline xmlns:a="http://schemas.openxmlformats.org/drawingml/2006/main" xmlns:pic="http://schemas.openxmlformats.org/drawingml/2006/picture">
+            <wp:extent cx="5220000" cy="2579414"/>
+            <wp:docPr id="11" name="Picture 11"/>
             <wp:cNvGraphicFramePr>
               <a:graphicFrameLocks noChangeAspect="1"/>
             </wp:cNvGraphicFramePr>
@@ -8039,7 +8272,7 @@
                     <pic:cNvPicPr/>
                   </pic:nvPicPr>
                   <pic:blipFill>
-                    <a:blip r:embed="rId17"/>
+                    <a:blip r:embed="rId20"/>
                     <a:stretch>
                       <a:fillRect/>
                     </a:stretch>
@@ -8047,7 +8280,7 @@
                   <pic:spPr>
                     <a:xfrm>
                       <a:off x="0" y="0"/>
-                      <a:ext cx="5220000" cy="3262500"/>
+                      <a:ext cx="5220000" cy="2579414"/>
                     </a:xfrm>
                     <a:prstGeom prst="rect"/>
                   </pic:spPr>
@@ -8071,7 +8304,7 @@
           <w:color w:val="4A5568"/>
           <w:sz w:val="19"/>
         </w:rPr>
-        <w:t>Figure — Atelier de plaidoirie : navigation guidée à travers les cinq étapes métier</w:t>
+        <w:t>Figure — Atelier plaidoirie — étape 1 (dossier &amp; pièces)</w:t>
       </w:r>
     </w:p>
     <w:p>
@@ -8083,7 +8316,7 @@
         <w:drawing>
           <wp:inline xmlns:a="http://schemas.openxmlformats.org/drawingml/2006/main" xmlns:pic="http://schemas.openxmlformats.org/drawingml/2006/picture">
             <wp:extent cx="5220000" cy="2441777"/>
-            <wp:docPr id="9" name="Picture 9"/>
+            <wp:docPr id="12" name="Picture 12"/>
             <wp:cNvGraphicFramePr>
               <a:graphicFrameLocks noChangeAspect="1"/>
             </wp:cNvGraphicFramePr>
@@ -8095,7 +8328,7 @@
                     <pic:cNvPicPr/>
                   </pic:nvPicPr>
                   <pic:blipFill>
-                    <a:blip r:embed="rId18"/>
+                    <a:blip r:embed="rId21"/>
                     <a:stretch>
                       <a:fillRect/>
                     </a:stretch>
@@ -8127,7 +8360,7 @@
           <w:color w:val="4A5568"/>
           <w:sz w:val="19"/>
         </w:rPr>
-        <w:t>Figure — Module de transcription : texte arabe nettoyé avec surlignage orange des corrections</w:t>
+        <w:t>Figure — Transcription / correction (arabe fusḥā)</w:t>
       </w:r>
     </w:p>
     <w:p>
@@ -8139,7 +8372,7 @@
         <w:drawing>
           <wp:inline xmlns:a="http://schemas.openxmlformats.org/drawingml/2006/main" xmlns:pic="http://schemas.openxmlformats.org/drawingml/2006/picture">
             <wp:extent cx="5220000" cy="2487656"/>
-            <wp:docPr id="10" name="Picture 10"/>
+            <wp:docPr id="13" name="Picture 13"/>
             <wp:cNvGraphicFramePr>
               <a:graphicFrameLocks noChangeAspect="1"/>
             </wp:cNvGraphicFramePr>
@@ -8151,7 +8384,7 @@
                     <pic:cNvPicPr/>
                   </pic:nvPicPr>
                   <pic:blipFill>
-                    <a:blip r:embed="rId19"/>
+                    <a:blip r:embed="rId22"/>
                     <a:stretch>
                       <a:fillRect/>
                     </a:stretch>
@@ -8183,7 +8416,7 @@
           <w:color w:val="4A5568"/>
           <w:sz w:val="19"/>
         </w:rPr>
-        <w:t>Figure — Aperçu du document officiel et bouton d'export Microsoft Word (.docx) 100 % éditable</w:t>
+        <w:t>Figure — Export Word de la plaidoirie</w:t>
       </w:r>
     </w:p>
     <w:p>
@@ -8194,8 +8427,8 @@
       <w:r>
         <w:drawing>
           <wp:inline xmlns:a="http://schemas.openxmlformats.org/drawingml/2006/main" xmlns:pic="http://schemas.openxmlformats.org/drawingml/2006/picture">
-            <wp:extent cx="5220000" cy="4752375"/>
-            <wp:docPr id="11" name="Picture 11"/>
+            <wp:extent cx="5220000" cy="4121625"/>
+            <wp:docPr id="14" name="Picture 14"/>
             <wp:cNvGraphicFramePr>
               <a:graphicFrameLocks noChangeAspect="1"/>
             </wp:cNvGraphicFramePr>
@@ -8203,11 +8436,11 @@
               <a:graphicData uri="http://schemas.openxmlformats.org/drawingml/2006/picture">
                 <pic:pic>
                   <pic:nvPicPr>
-                    <pic:cNvPr id="0" name="15-planning.png"/>
+                    <pic:cNvPr id="0" name="16-equipe.png"/>
                     <pic:cNvPicPr/>
                   </pic:nvPicPr>
                   <pic:blipFill>
-                    <a:blip r:embed="rId20"/>
+                    <a:blip r:embed="rId23"/>
                     <a:stretch>
                       <a:fillRect/>
                     </a:stretch>
@@ -8215,7 +8448,7 @@
                   <pic:spPr>
                     <a:xfrm>
                       <a:off x="0" y="0"/>
-                      <a:ext cx="5220000" cy="4752375"/>
+                      <a:ext cx="5220000" cy="4121625"/>
                     </a:xfrm>
                     <a:prstGeom prst="rect"/>
                   </pic:spPr>
@@ -8239,7 +8472,7 @@
           <w:color w:val="4A5568"/>
           <w:sz w:val="19"/>
         </w:rPr>
-        <w:t>Figure — Module de planning : agenda visuel des audiences et rappels automatiques</w:t>
+        <w:t>Figure — Équipe — invitations et rôles</w:t>
       </w:r>
     </w:p>
     <w:p>
@@ -8251,7 +8484,7 @@
         <w:drawing>
           <wp:inline xmlns:a="http://schemas.openxmlformats.org/drawingml/2006/main" xmlns:pic="http://schemas.openxmlformats.org/drawingml/2006/picture">
             <wp:extent cx="5220000" cy="2370410"/>
-            <wp:docPr id="12" name="Picture 12"/>
+            <wp:docPr id="15" name="Picture 15"/>
             <wp:cNvGraphicFramePr>
               <a:graphicFrameLocks noChangeAspect="1"/>
             </wp:cNvGraphicFramePr>
@@ -8263,7 +8496,7 @@
                     <pic:cNvPicPr/>
                   </pic:nvPicPr>
                   <pic:blipFill>
-                    <a:blip r:embed="rId21"/>
+                    <a:blip r:embed="rId24"/>
                     <a:stretch>
                       <a:fillRect/>
                     </a:stretch>
@@ -8295,63 +8528,7 @@
           <w:color w:val="4A5568"/>
           <w:sz w:val="19"/>
         </w:rPr>
-        <w:t>Figure — Fil d'activité collaboratif du cabinet pour la traçabilité des opérations</w:t>
-      </w:r>
-    </w:p>
-    <w:p>
-      <w:pPr>
-        <w:spacing w:before="160" w:after="60"/>
-        <w:jc w:val="center"/>
-      </w:pPr>
-      <w:r>
-        <w:drawing>
-          <wp:inline xmlns:a="http://schemas.openxmlformats.org/drawingml/2006/main" xmlns:pic="http://schemas.openxmlformats.org/drawingml/2006/picture">
-            <wp:extent cx="5220000" cy="4121625"/>
-            <wp:docPr id="13" name="Picture 13"/>
-            <wp:cNvGraphicFramePr>
-              <a:graphicFrameLocks noChangeAspect="1"/>
-            </wp:cNvGraphicFramePr>
-            <a:graphic>
-              <a:graphicData uri="http://schemas.openxmlformats.org/drawingml/2006/picture">
-                <pic:pic>
-                  <pic:nvPicPr>
-                    <pic:cNvPr id="0" name="16-equipe.png"/>
-                    <pic:cNvPicPr/>
-                  </pic:nvPicPr>
-                  <pic:blipFill>
-                    <a:blip r:embed="rId22"/>
-                    <a:stretch>
-                      <a:fillRect/>
-                    </a:stretch>
-                  </pic:blipFill>
-                  <pic:spPr>
-                    <a:xfrm>
-                      <a:off x="0" y="0"/>
-                      <a:ext cx="5220000" cy="4121625"/>
-                    </a:xfrm>
-                    <a:prstGeom prst="rect"/>
-                  </pic:spPr>
-                </pic:pic>
-              </a:graphicData>
-            </a:graphic>
-          </wp:inline>
-        </w:drawing>
-      </w:r>
-    </w:p>
-    <w:p>
-      <w:pPr>
-        <w:spacing w:after="160"/>
-        <w:jc w:val="center"/>
-      </w:pPr>
-      <w:r>
-        <w:rPr>
-          <w:rFonts w:ascii="Calibri" w:hAnsi="Calibri" w:eastAsia="Calibri"/>
-          <w:b w:val="0"/>
-          <w:i/>
-          <w:color w:val="4A5568"/>
-          <w:sz w:val="19"/>
-        </w:rPr>
-        <w:t>Figure — Gestion de l'équipe du cabinet : attribution des rôles et invitation d'assistants</w:t>
+        <w:t>Figure — Journal d'activité du cabinet</w:t>
       </w:r>
     </w:p>
     <w:p>
@@ -8363,7 +8540,7 @@
         <w:drawing>
           <wp:inline xmlns:a="http://schemas.openxmlformats.org/drawingml/2006/main" xmlns:pic="http://schemas.openxmlformats.org/drawingml/2006/picture">
             <wp:extent cx="5220000" cy="2492754"/>
-            <wp:docPr id="14" name="Picture 14"/>
+            <wp:docPr id="16" name="Picture 16"/>
             <wp:cNvGraphicFramePr>
               <a:graphicFrameLocks noChangeAspect="1"/>
             </wp:cNvGraphicFramePr>
@@ -8375,7 +8552,7 @@
                     <pic:cNvPicPr/>
                   </pic:nvPicPr>
                   <pic:blipFill>
-                    <a:blip r:embed="rId23"/>
+                    <a:blip r:embed="rId25"/>
                     <a:stretch>
                       <a:fillRect/>
                     </a:stretch>
@@ -8407,7 +8584,7 @@
           <w:color w:val="4A5568"/>
           <w:sz w:val="19"/>
         </w:rPr>
-        <w:t>Figure — Tableau de bord de supervision de la plateforme (administration WebVoice)</w:t>
+        <w:t>Figure — Admin plateforme — pilotage LexHub</w:t>
       </w:r>
     </w:p>
     <w:sectPr>

</xml_diff>